<commit_message>
feat: 适配 WeBASE 3.1.1 并完成 Ubuntu 部署
链网关按 WeBASE 3.x 协议改造：群组标识改为 group0、funcParam 按原文编码、区块字段兼容 parentInfo/sealerList。交易归属不再依赖事件订阅式查询（结果不稳定），改为按 ABI 现算 certify 选择器并本地解码交易入参，区块明细随之免去逐笔回链查询。补充 Linux 合约部署脚本与 Keccak256 工具，文档同步到 FISCO BCOS 3.x / Solidity 0.8.x。
</commit_message>
<xml_diff>
--- a/docs/企业碳排放认证与溯源系统设计方案.docx
+++ b/docs/企业碳排放认证与溯源系统设计方案.docx
@@ -87,7 +87,7 @@
           <w:sz w:val="18"/>
           <w:szCs w:val="18"/>
         </w:rPr>
-        <w:t>技术基线：Spring Boot 3.4.3 · Vue 3 + Vite 5 · MySQL 8 · FISCO BCOS 2.9.x · WeBASE 1.5.x · Solidity 0.6.10</w:t>
+        <w:t>技术基线：Spring Boot 3.4.3 · Vue 3 + Vite 5 · MySQL 8 · FISCO BCOS 3.x · WeBASE 3.1.1 · Solidity 0.8.x</w:t>
       </w:r>
     </w:p>
     <w:p>
@@ -1240,7 +1240,7 @@
                 <w:sz w:val="19"/>
                 <w:szCs w:val="19"/>
               </w:rPr>
-              <w:t>FISCO BCOS 2.9.x 节点 + WeBASE 1.5.x（WeBASE-Front 5002 / WeBASE-Sign 5004）</w:t>
+              <w:t>FISCO BCOS 3.x 节点 + WeBASE 3.1.1（WeBASE-Front 5002 / WeBASE-Sign 5004）</w:t>
             </w:r>
           </w:p>
         </w:tc>
@@ -1323,7 +1323,7 @@
                 <w:sz w:val="19"/>
                 <w:szCs w:val="19"/>
               </w:rPr>
-              <w:t>Solidity 0.6.10（CarbonCertRegistry 认证存证 + CarbonCompliance 合规判定）</w:t>
+              <w:t>Solidity 0.8.x（CarbonCertRegistry 认证存证 + CarbonCompliance 合规判定）</w:t>
             </w:r>
           </w:p>
         </w:tc>
@@ -13997,7 +13997,7 @@
         <w:spacing w:before="40" w:after="80" w:line="300" w:lineRule="auto"/>
       </w:pPr>
       <w:r>
-        <w:t>合约用 Solidity 0.6.10 编写，部署在 FISCO BCOS 联盟链上（经 WeBASE-Front 编译与部署），源码位于 houduan/contracts/，ABI 随仓库提供（src/main/resources/chain/）。</w:t>
+        <w:t>合约用 Solidity 0.8.x 编写，部署在 FISCO BCOS 联盟链上（以 solc 0.8.30 编译后经 WeBASE-Front 部署），源码位于 houduan/contracts/，ABI 随仓库提供（src/main/resources/chain/）。</w:t>
       </w:r>
     </w:p>
     <w:p>
@@ -15654,7 +15654,7 @@
         <w:spacing w:before="20" w:after="40" w:line="290" w:lineRule="auto"/>
       </w:pPr>
       <w:r>
-        <w:t>准备联盟链：启动 FISCO BCOS 2.9.x 节点与 WeBASE（Front 5002 / Sign 5004）；</w:t>
+        <w:t>准备联盟链：启动 FISCO BCOS 3.x 节点与 WeBASE（Front 5002 / Sign 5004）；</w:t>
       </w:r>
     </w:p>
     <w:p>
@@ -16492,7 +16492,7 @@
         <w:spacing w:before="20" w:after="40" w:line="290" w:lineRule="auto"/>
       </w:pPr>
       <w:r>
-        <w:t>SOLIDITY 0.6.10 两个合约（认证存证 + 合规判定）与 ABI 随仓库提供；</w:t>
+        <w:t>SOLIDITY 0.8.x 两个合约（认证存证 + 合规判定）与 ABI 随仓库提供；</w:t>
       </w:r>
     </w:p>
     <w:p>

</xml_diff>

<commit_message>
docs: 设计方案技术基线更新为 JDK 25 与 Spring Boot 3.5.16
</commit_message>
<xml_diff>
--- a/docs/企业碳排放认证与溯源系统设计方案.docx
+++ b/docs/企业碳排放认证与溯源系统设计方案.docx
@@ -87,7 +87,7 @@
           <w:sz w:val="18"/>
           <w:szCs w:val="18"/>
         </w:rPr>
-        <w:t>技术基线：Spring Boot 3.4.3 · Vue 3 + Vite 5 · MySQL 8 · FISCO BCOS 3.x · WeBASE 3.1.1 · Solidity 0.8.x</w:t>
+        <w:t>技术基线：Spring Boot 3.5.16 · Vue 3 + Vite 5 · MySQL 8 · FISCO BCOS 3.x · WeBASE 3.1.1 · Solidity 0.8.x</w:t>
       </w:r>
     </w:p>
     <w:p>
@@ -1074,7 +1074,7 @@
                 <w:sz w:val="19"/>
                 <w:szCs w:val="19"/>
               </w:rPr>
-              <w:t>Spring Boot 3.4.3 单体应用 + MyBatis-Plus 3.5.9 + JDK 17 + Lombok</w:t>
+              <w:t>Spring Boot 3.5.16 单体应用 + MyBatis-Plus 3.5.9 + JDK 25 + Lombok</w:t>
             </w:r>
           </w:p>
         </w:tc>

</xml_diff>